<commit_message>
add valuation model and modify UI
</commit_message>
<xml_diff>
--- a/Misc/Workbench_v2_Version_History.docx
+++ b/Misc/Workbench_v2_Version_History.docx
@@ -824,6 +824,82 @@
           </w:p>
         </w:tc>
       </w:tr>
+      <w:tr>
+        <w:tc>
+          <w:tcPr/>
+          <w:p>
+            <w:pPr>
+              <w:pStyle w:val="Compact"/>
+              <w:jc w:val="left"/>
+            </w:pPr>
+            <w:r>
+              <w:t xml:space="preserve">2.24.0</w:t>
+            </w:r>
+          </w:p>
+        </w:tc>
+        <w:tc>
+          <w:tcPr/>
+          <w:p>
+            <w:pPr>
+              <w:pStyle w:val="Compact"/>
+              <w:jc w:val="left"/>
+            </w:pPr>
+            <w:r>
+              <w:t xml:space="preserve">10/14</w:t>
+            </w:r>
+          </w:p>
+        </w:tc>
+        <w:tc>
+          <w:tcPr/>
+          <w:p>
+            <w:pPr>
+              <w:pStyle w:val="Compact"/>
+              <w:jc w:val="left"/>
+            </w:pPr>
+            <w:r>
+              <w:t xml:space="preserve">Valuation records: re-importing a ticker replaces earlier imports nothing uses, any saved record can be deleted after confirmation (data still used by a saved result is protected), and unused imports can be cleared; English / Chinese switch for the valuation lab (Guide, help bubbles, conclusion and notes); the question to write down is shown on the company page for every company, editable, with an optional look-again date; fixes to the lifecycle and API tests; README rewritten for GitHub with an app overview.</w:t>
+            </w:r>
+          </w:p>
+        </w:tc>
+      </w:tr>
+      <w:tr>
+        <w:tc>
+          <w:tcPr/>
+          <w:p>
+            <w:pPr>
+              <w:pStyle w:val="Compact"/>
+              <w:jc w:val="left"/>
+            </w:pPr>
+            <w:r>
+              <w:t>2.25.0</w:t>
+            </w:r>
+          </w:p>
+        </w:tc>
+        <w:tc>
+          <w:tcPr/>
+          <w:p>
+            <w:pPr>
+              <w:pStyle w:val="Compact"/>
+              <w:jc w:val="left"/>
+            </w:pPr>
+            <w:r>
+              <w:t>10/17</w:t>
+            </w:r>
+          </w:p>
+        </w:tc>
+        <w:tc>
+          <w:tcPr/>
+          <w:p>
+            <w:pPr>
+              <w:pStyle w:val="Compact"/>
+              <w:jc w:val="left"/>
+            </w:pPr>
+            <w:r>
+              <w:t>Other currencies (0883.HK: HKD price, CNY accounts) converted at one spot rate and labelled; Fundamentals tab regrouped into what you pay / what you get / the record; Overview digest titles match their sections, tiles jump to them; sort by best/worst P&amp;L and weight.</w:t>
+            </w:r>
+          </w:p>
+        </w:tc>
+      </w:tr>
     </w:tbl>
     <w:p>
       <w:pPr>

</xml_diff>